<commit_message>
Update: Dateien ohne Datenbanken (database SQL ignoriert)
</commit_message>
<xml_diff>
--- a/Daten/Spät/FO_CGN_27_Unpünktlicher Dienstantritt.docx
+++ b/Daten/Spät/FO_CGN_27_Unpünktlicher Dienstantritt.docx
@@ -1040,24 +1040,6 @@
           <w:lang w:eastAsia="de-DE"/>
         </w:rPr>
       </w:pPr>
-    </w:p>
-    <w:p>
-      <w:pPr>
-        <w:spacing w:after="0" w:line="240" w:lineRule="auto"/>
-        <w:rPr>
-          <w:rFonts w:ascii="Arial" w:eastAsia="Times New Roman" w:hAnsi="Arial" w:cs="Arial"/>
-          <w:sz w:val="24"/>
-          <w:lang w:eastAsia="de-DE"/>
-        </w:rPr>
-      </w:pPr>
-      <w:r>
-        <w:rPr>
-          <w:rFonts w:ascii="Arial" w:eastAsia="Times New Roman" w:hAnsi="Arial" w:cs="Arial"/>
-          <w:sz w:val="24"/>
-          <w:lang w:eastAsia="de-DE"/>
-        </w:rPr>
-        <w:t>Lytek</w:t>
-      </w:r>
     </w:p>
     <w:p>
       <w:pPr>

</xml_diff>